<commit_message>
Update Word project reports (.docx) with new dark UI screenshots, live deployment URLs, and GenAI Copilot section
</commit_message>
<xml_diff>
--- a/TelcoPulse_AI_GenAI_LB1_Project_Report_Anaganti_Sairishikesh.docx
+++ b/TelcoPulse_AI_GenAI_LB1_Project_Report_Anaganti_Sairishikesh.docx
@@ -2949,7 +2949,7 @@
                 <w:color w:val="1F2937"/>
                 <w:sz w:val="18"/>
               </w:rPr>
-              <w:t>Streamlit 1.30+ (Reactive state management, interactive multi-tab layout)</w:t>
+              <w:t>Streamlit 1.30+ (Glassmorphism dark UI, reactive state management, interactive multi-tab layout)</w:t>
             </w:r>
           </w:p>
         </w:tc>
@@ -3001,7 +3001,7 @@
                 <w:color w:val="1F2937"/>
                 <w:sz w:val="18"/>
               </w:rPr>
-              <w:t>Google Gemini API / Contextual Large Language Model Architecture</w:t>
+              <w:t>Google Gemini Cloud API (gemini-1.5-flash) &amp; Stochastic Multi-Angle Contextual Engine</w:t>
             </w:r>
           </w:p>
         </w:tc>
@@ -3028,6 +3028,58 @@
                 <w:color w:val="1F2937"/>
                 <w:sz w:val="18"/>
               </w:rPr>
+              <w:t>Creativity &amp; Temperature</w:t>
+            </w:r>
+          </w:p>
+        </w:tc>
+        <w:tc>
+          <w:tcPr>
+            <w:tcW w:type="dxa" w:w="6480"/>
+            <w:shd w:fill="F8FAFC"/>
+            <w:tcMar>
+              <w:top w:w="70" w:type="dxa"/>
+              <w:bottom w:w="70" w:type="dxa"/>
+              <w:left w:w="90" w:type="dxa"/>
+              <w:right w:w="90" w:type="dxa"/>
+            </w:tcMar>
+          </w:tcPr>
+          <w:p>
+            <w:pPr>
+              <w:jc w:val="center"/>
+            </w:pPr>
+            <w:r>
+              <w:rPr>
+                <w:rFonts w:ascii="Calibri" w:hAnsi="Calibri"/>
+                <w:color w:val="1F2937"/>
+                <w:sz w:val="18"/>
+              </w:rPr>
+              <w:t>Stochastic temperature sampling (0.2–1.0) with non-deterministic narrative multi-angle reasoning</w:t>
+            </w:r>
+          </w:p>
+        </w:tc>
+      </w:tr>
+      <w:tr>
+        <w:tc>
+          <w:tcPr>
+            <w:tcW w:type="dxa" w:w="3168"/>
+            <w:shd w:fill="FFFFFF"/>
+            <w:tcMar>
+              <w:top w:w="70" w:type="dxa"/>
+              <w:bottom w:w="70" w:type="dxa"/>
+              <w:left w:w="90" w:type="dxa"/>
+              <w:right w:w="90" w:type="dxa"/>
+            </w:tcMar>
+          </w:tcPr>
+          <w:p>
+            <w:pPr>
+              <w:jc w:val="left"/>
+            </w:pPr>
+            <w:r>
+              <w:rPr>
+                <w:rFonts w:ascii="Calibri" w:hAnsi="Calibri"/>
+                <w:color w:val="1F2937"/>
+                <w:sz w:val="18"/>
+              </w:rPr>
               <w:t>Predictive ML Engine</w:t>
             </w:r>
           </w:p>
@@ -3035,7 +3087,7 @@
         <w:tc>
           <w:tcPr>
             <w:tcW w:type="dxa" w:w="6480"/>
-            <w:shd w:fill="F8FAFC"/>
+            <w:shd w:fill="FFFFFF"/>
             <w:tcMar>
               <w:top w:w="70" w:type="dxa"/>
               <w:bottom w:w="70" w:type="dxa"/>
@@ -3062,7 +3114,7 @@
         <w:tc>
           <w:tcPr>
             <w:tcW w:type="dxa" w:w="3168"/>
-            <w:shd w:fill="FFFFFF"/>
+            <w:shd w:fill="F8FAFC"/>
             <w:tcMar>
               <w:top w:w="70" w:type="dxa"/>
               <w:bottom w:w="70" w:type="dxa"/>
@@ -3087,7 +3139,7 @@
         <w:tc>
           <w:tcPr>
             <w:tcW w:type="dxa" w:w="6480"/>
-            <w:shd w:fill="FFFFFF"/>
+            <w:shd w:fill="F8FAFC"/>
             <w:tcMar>
               <w:top w:w="70" w:type="dxa"/>
               <w:bottom w:w="70" w:type="dxa"/>
@@ -3114,6 +3166,58 @@
         <w:tc>
           <w:tcPr>
             <w:tcW w:type="dxa" w:w="3168"/>
+            <w:shd w:fill="FFFFFF"/>
+            <w:tcMar>
+              <w:top w:w="70" w:type="dxa"/>
+              <w:bottom w:w="70" w:type="dxa"/>
+              <w:left w:w="90" w:type="dxa"/>
+              <w:right w:w="90" w:type="dxa"/>
+            </w:tcMar>
+          </w:tcPr>
+          <w:p>
+            <w:pPr>
+              <w:jc w:val="left"/>
+            </w:pPr>
+            <w:r>
+              <w:rPr>
+                <w:rFonts w:ascii="Calibri" w:hAnsi="Calibri"/>
+                <w:color w:val="1F2937"/>
+                <w:sz w:val="18"/>
+              </w:rPr>
+              <w:t>Live Cloud Deployment</w:t>
+            </w:r>
+          </w:p>
+        </w:tc>
+        <w:tc>
+          <w:tcPr>
+            <w:tcW w:type="dxa" w:w="6480"/>
+            <w:shd w:fill="FFFFFF"/>
+            <w:tcMar>
+              <w:top w:w="70" w:type="dxa"/>
+              <w:bottom w:w="70" w:type="dxa"/>
+              <w:left w:w="90" w:type="dxa"/>
+              <w:right w:w="90" w:type="dxa"/>
+            </w:tcMar>
+          </w:tcPr>
+          <w:p>
+            <w:pPr>
+              <w:jc w:val="center"/>
+            </w:pPr>
+            <w:r>
+              <w:rPr>
+                <w:rFonts w:ascii="Calibri" w:hAnsi="Calibri"/>
+                <w:color w:val="1F2937"/>
+                <w:sz w:val="18"/>
+              </w:rPr>
+              <w:t>Streamlit Community Cloud (https://telecomcustomers.streamlit.app/)</w:t>
+            </w:r>
+          </w:p>
+        </w:tc>
+      </w:tr>
+      <w:tr>
+        <w:tc>
+          <w:tcPr>
+            <w:tcW w:type="dxa" w:w="3168"/>
             <w:shd w:fill="F8FAFC"/>
             <w:tcMar>
               <w:top w:w="70" w:type="dxa"/>
@@ -3132,7 +3236,7 @@
                 <w:color w:val="1F2937"/>
                 <w:sz w:val="18"/>
               </w:rPr>
-              <w:t>Deployment Platform</w:t>
+              <w:t>Source Code Repository</w:t>
             </w:r>
           </w:p>
         </w:tc>
@@ -3157,7 +3261,7 @@
                 <w:color w:val="1F2937"/>
                 <w:sz w:val="18"/>
               </w:rPr>
-              <w:t>Streamlit Community Cloud (Live Continuous Deployment linked to GitHub)</w:t>
+              <w:t>GitHub (https://github.com/Likisai/telecom-customer-churn.git)</w:t>
             </w:r>
           </w:p>
         </w:tc>
@@ -3176,7 +3280,7 @@
           <w:color w:val="2563EB"/>
           <w:sz w:val="26"/>
         </w:rPr>
-        <w:t>7.1 Structured Prompt Engineering Implementation</w:t>
+        <w:t>7.1 Structured Prompt Engineering &amp; Temperature Control</w:t>
       </w:r>
     </w:p>
     <w:p>
@@ -3189,7 +3293,7 @@
           <w:color w:val="374151"/>
           <w:sz w:val="22"/>
         </w:rPr>
-        <w:t>The system utilizes a structured few-shot system prompt that enforces strict business rules, tone calibration, and JSON schema formatting:</w:t>
+        <w:t>The system utilizes a structured few-shot system prompt with temperature-controlled stochastic sampling (0.2 to 1.0) that enforces strict business rules, tone calibration, and JSON schema formatting:</w:t>
       </w:r>
     </w:p>
     <w:tbl>
@@ -3223,7 +3327,7 @@
                 <w:color w:val="E2E8F0"/>
                 <w:sz w:val="18"/>
               </w:rPr>
-              <w:t># Structured System Prompt Template for Retention Copilot</w:t>
+              <w:t># Structured System Prompt Template with Temperature Control</w:t>
               <w:br/>
               <w:t>SYSTEM_PROMPT = """</w:t>
               <w:br/>
@@ -3251,6 +3355,8 @@
               <w:t>- Persona Tone: {persona_tone}</w:t>
               <w:br/>
               <w:t>- Target Channel: {communication_channel}</w:t>
+              <w:br/>
+              <w:t>- AI Creativity / Temperature: {temperature} (Range: 0.2 - 1.0)</w:t>
               <w:br/>
               <w:br/>
               <w:t>TASK REQUIREMENTS:</w:t>
@@ -3287,7 +3393,7 @@
           <w:color w:val="2563EB"/>
           <w:sz w:val="26"/>
         </w:rPr>
-        <w:t>7.2 GenAI Execution &amp; Response Parsing Function</w:t>
+        <w:t>7.2 Stochastic Multi-Angle Reasoning &amp; Execution Function</w:t>
       </w:r>
     </w:p>
     <w:tbl>
@@ -3321,45 +3427,45 @@
                 <w:color w:val="E2E8F0"/>
                 <w:sz w:val="18"/>
               </w:rPr>
-              <w:t># GenAI Retention Asset Generation &amp; Dispatch Function</w:t>
+              <w:t># Dynamic Stochastic GenAI Generation &amp; Dispatch Function</w:t>
               <w:br/>
-              <w:t>def generate_retention_campaign(customer_profile, campaign_config):</w:t>
+              <w:t xml:space="preserve">def generate_dynamic_retention_campaign(c_name, c_risk_tier, c_tenure, c_mcharges, </w:t>
               <w:br/>
-              <w:t xml:space="preserve">    # Calculate mathematically optimized concession parameters</w:t>
+              <w:t xml:space="preserve">                                        c_drivers, c_goal, c_tone, c_channel, </w:t>
               <w:br/>
-              <w:t xml:space="preserve">    discount_rate = 0.20 # 20% loyalty incentive</w:t>
+              <w:t xml:space="preserve">                                        temperature=0.85, api_key=None):</w:t>
               <w:br/>
-              <w:t xml:space="preserve">    discount_val = round(customer_profile['monthly_charges'] * discount_rate, 2)</w:t>
+              <w:t xml:space="preserve">    # 1. Stochastic Narrative Framing Sampling (Milestone, Proactive Audit, VIP, Friction-Removal)</w:t>
               <w:br/>
-              <w:t xml:space="preserve">    new_mrr = round(customer_profile['monthly_charges'] - discount_val, 2)</w:t>
+              <w:t xml:space="preserve">    chosen_hook = random.choice(narrative_hooks)</w:t>
               <w:br/>
               <w:t xml:space="preserve">    </w:t>
               <w:br/>
-              <w:t xml:space="preserve">    # Assemble prompt with parameterized context</w:t>
+              <w:t xml:space="preserve">    # 2. Dynamic Concession Calculation with Temperature Fluctuation</w:t>
               <w:br/>
-              <w:t xml:space="preserve">    prompt = SYSTEM_PROMPT.format(</w:t>
+              <w:t xml:space="preserve">    base_disc = 0.25 if "Emergency" in c_goal else 0.20</w:t>
               <w:br/>
-              <w:t xml:space="preserve">        customer_name=customer_profile['name'],</w:t>
+              <w:t xml:space="preserve">    final_disc_rate = max(0.10, min(0.35, base_disc + random.choice([-0.02, 0.0, 0.02])))</w:t>
               <w:br/>
-              <w:t xml:space="preserve">        risk_tier=customer_profile['risk_tier'],</w:t>
+              <w:t xml:space="preserve">    discount_val = round(c_mcharges * final_disc_rate, 2)</w:t>
               <w:br/>
-              <w:t xml:space="preserve">        monthly_charges=customer_profile['monthly_charges'],</w:t>
-              <w:br/>
-              <w:t xml:space="preserve">        discount_amount=discount_val,</w:t>
-              <w:br/>
-              <w:t xml:space="preserve">        new_bill=new_mrr,</w:t>
-              <w:br/>
-              <w:t xml:space="preserve">        ...</w:t>
-              <w:br/>
-              <w:t xml:space="preserve">    )</w:t>
+              <w:t xml:space="preserve">    new_bill = round(c_mcharges - discount_val, 2)</w:t>
               <w:br/>
               <w:t xml:space="preserve">    </w:t>
               <w:br/>
-              <w:t xml:space="preserve">    # Execute LLM Inference &amp; Return Multi-Channel Tabular Assets</w:t>
+              <w:t xml:space="preserve">    # 3. Live Google Gemini Cloud API Call (or High-Precision Local Synthesis)</w:t>
               <w:br/>
-              <w:t xml:space="preserve">    response_payload = execute_llm_inference(prompt)</w:t>
+              <w:t xml:space="preserve">    if api_key:</w:t>
               <w:br/>
-              <w:t xml:space="preserve">    return response_payload</w:t>
+              <w:t xml:space="preserve">        response = call_google_gemini_api(prompt, temperature=temperature)</w:t>
+              <w:br/>
+              <w:t xml:space="preserve">        return response</w:t>
+              <w:br/>
+              <w:t xml:space="preserve">    </w:t>
+              <w:br/>
+              <w:t xml:space="preserve">    # 4. Assemble Multi-Channel Assets (Email, Agent Script, Concessions, CRM JSON)</w:t>
+              <w:br/>
+              <w:t xml:space="preserve">    return assemble_retention_payload(...)</w:t>
             </w:r>
           </w:p>
         </w:tc>
@@ -3401,7 +3507,7 @@
           <w:color w:val="374151"/>
           <w:sz w:val="22"/>
         </w:rPr>
-        <w:t>The TelcoPulse GenAI platform provides a seamless, production-ready interface across all retention workflows:</w:t>
+        <w:t>The TelcoPulse GenAI platform provides an enterprise glassmorphic web interface (Live at https://telecomcustomers.streamlit.app/) across all retention modules:</w:t>
       </w:r>
     </w:p>
     <w:p>
@@ -3430,14 +3536,14 @@
           <w:color w:val="374151"/>
           <w:sz w:val="22"/>
         </w:rPr>
-        <w:t>Displays the prompt configuration sidebar, subscriber telemetry inputs, and the four generated AI tabs: personalized win-back email, agent call script, concession matrix, and CRM JSON payload.</w:t>
+        <w:t>Displays the prompt configuration sidebar, subscriber telemetry inputs, Creativity/Temperature slider, and the four generated AI tabs: personalized win-back email, agent call script, concession matrix, and CRM JSON payload.</w:t>
       </w:r>
     </w:p>
     <w:p>
       <w:r>
         <w:drawing>
           <wp:inline xmlns:a="http://schemas.openxmlformats.org/drawingml/2006/main" xmlns:pic="http://schemas.openxmlformats.org/drawingml/2006/picture">
-            <wp:extent cx="5486400" cy="3708186"/>
+            <wp:extent cx="5486400" cy="3593780"/>
             <wp:docPr id="2" name="Picture 2"/>
             <wp:cNvGraphicFramePr>
               <a:graphicFrameLocks noChangeAspect="1"/>
@@ -3458,7 +3564,7 @@
                   <pic:spPr>
                     <a:xfrm>
                       <a:off x="0" y="0"/>
-                      <a:ext cx="5486400" cy="3708186"/>
+                      <a:ext cx="5486400" cy="3593780"/>
                     </a:xfrm>
                     <a:prstGeom prst="rect"/>
                   </pic:spPr>
@@ -3517,7 +3623,7 @@
       <w:r>
         <w:drawing>
           <wp:inline xmlns:a="http://schemas.openxmlformats.org/drawingml/2006/main" xmlns:pic="http://schemas.openxmlformats.org/drawingml/2006/picture">
-            <wp:extent cx="5486400" cy="3722914"/>
+            <wp:extent cx="5486400" cy="3593780"/>
             <wp:docPr id="3" name="Picture 3"/>
             <wp:cNvGraphicFramePr>
               <a:graphicFrameLocks noChangeAspect="1"/>
@@ -3538,7 +3644,7 @@
                   <pic:spPr>
                     <a:xfrm>
                       <a:off x="0" y="0"/>
-                      <a:ext cx="5486400" cy="3722914"/>
+                      <a:ext cx="5486400" cy="3593780"/>
                     </a:xfrm>
                     <a:prstGeom prst="rect"/>
                   </pic:spPr>
@@ -3597,7 +3703,7 @@
       <w:r>
         <w:drawing>
           <wp:inline xmlns:a="http://schemas.openxmlformats.org/drawingml/2006/main" xmlns:pic="http://schemas.openxmlformats.org/drawingml/2006/picture">
-            <wp:extent cx="5486400" cy="3722914"/>
+            <wp:extent cx="5486400" cy="3593780"/>
             <wp:docPr id="4" name="Picture 4"/>
             <wp:cNvGraphicFramePr>
               <a:graphicFrameLocks noChangeAspect="1"/>
@@ -3618,7 +3724,7 @@
                   <pic:spPr>
                     <a:xfrm>
                       <a:off x="0" y="0"/>
-                      <a:ext cx="5486400" cy="3722914"/>
+                      <a:ext cx="5486400" cy="3593780"/>
                     </a:xfrm>
                     <a:prstGeom prst="rect"/>
                   </pic:spPr>
@@ -3677,7 +3783,7 @@
       <w:r>
         <w:drawing>
           <wp:inline xmlns:a="http://schemas.openxmlformats.org/drawingml/2006/main" xmlns:pic="http://schemas.openxmlformats.org/drawingml/2006/picture">
-            <wp:extent cx="5486400" cy="3722914"/>
+            <wp:extent cx="5486400" cy="3593780"/>
             <wp:docPr id="5" name="Picture 5"/>
             <wp:cNvGraphicFramePr>
               <a:graphicFrameLocks noChangeAspect="1"/>
@@ -3698,7 +3804,7 @@
                   <pic:spPr>
                     <a:xfrm>
                       <a:off x="0" y="0"/>
-                      <a:ext cx="5486400" cy="3722914"/>
+                      <a:ext cx="5486400" cy="3593780"/>
                     </a:xfrm>
                     <a:prstGeom prst="rect"/>
                   </pic:spPr>
@@ -3757,7 +3863,7 @@
       <w:r>
         <w:drawing>
           <wp:inline xmlns:a="http://schemas.openxmlformats.org/drawingml/2006/main" xmlns:pic="http://schemas.openxmlformats.org/drawingml/2006/picture">
-            <wp:extent cx="5486400" cy="3722914"/>
+            <wp:extent cx="5486400" cy="3593780"/>
             <wp:docPr id="6" name="Picture 6"/>
             <wp:cNvGraphicFramePr>
               <a:graphicFrameLocks noChangeAspect="1"/>
@@ -3778,7 +3884,7 @@
                   <pic:spPr>
                     <a:xfrm>
                       <a:off x="0" y="0"/>
-                      <a:ext cx="5486400" cy="3722914"/>
+                      <a:ext cx="5486400" cy="3593780"/>
                     </a:xfrm>
                     <a:prstGeom prst="rect"/>
                   </pic:spPr>
@@ -3839,6 +3945,29 @@
           <w:sz w:val="26"/>
         </w:rPr>
         <w:t>9.1 Technical Challenges Encountered</w:t>
+      </w:r>
+    </w:p>
+    <w:p>
+      <w:pPr>
+        <w:pStyle w:val="ListBullet"/>
+        <w:spacing w:after="60" w:line="276" w:lineRule="auto"/>
+      </w:pPr>
+      <w:r>
+        <w:rPr>
+          <w:rFonts w:ascii="Calibri" w:hAnsi="Calibri"/>
+          <w:b/>
+          <w:color w:val="1F2937"/>
+          <w:sz w:val="22"/>
+        </w:rPr>
+        <w:t xml:space="preserve">• Markdown &amp; Currency Math Escaping: </w:t>
+      </w:r>
+      <w:r>
+        <w:rPr>
+          <w:rFonts w:ascii="Calibri" w:hAnsi="Calibri"/>
+          <w:color w:val="374151"/>
+          <w:sz w:val="22"/>
+        </w:rPr>
+        <w:t>Preventing unescaped currency symbols ($) from colliding with web markdown LaTeX math engines. Resolved by implementing strict dollar-sign escaping (\$) and double-spaced bullet formatting.</w:t>
       </w:r>
     </w:p>
     <w:p>
@@ -4044,7 +4173,7 @@
           <w:color w:val="374151"/>
           <w:sz w:val="22"/>
         </w:rPr>
-        <w:t>A full-featured Generative AI decision support platform was successfully developed, tested, and deployed to Streamlit Community Cloud.</w:t>
+        <w:t>A full-featured Generative AI decision support platform was successfully developed, tested, and deployed to Streamlit Community Cloud (https://telecomcustomers.streamlit.app/).</w:t>
       </w:r>
     </w:p>
     <w:p>
@@ -4113,7 +4242,7 @@
           <w:color w:val="374151"/>
           <w:sz w:val="22"/>
         </w:rPr>
-        <w:t>Mastered structured prompt engineering, LLM API integration, UI design with Streamlit, and hybrid AI system architectures.</w:t>
+        <w:t>Mastered structured prompt engineering, stochastic temperature sampling, LLM API integration, UI design with Streamlit, and hybrid AI system architectures.</w:t>
       </w:r>
     </w:p>
     <w:p>

</xml_diff>